<commit_message>
Apply house style to all docs: Arial 12, 1.5 spacing, justified
- scripts/make-reference-docx.py builds scripts/reference.docx (Arial 12, 1.5 line, justified body, left headings)
- export-docs.sh / export-chapters.sh use the reference doc
- Regenerate all docx + pdf (incl. new plan docx/pdf)
- plan §12: document the house style
</commit_message>
<xml_diff>
--- a/docs/Volume I/Chapter 0/Volume-I-Chapter-0-Homework.docx
+++ b/docs/Volume I/Chapter 0/Volume-I-Chapter-0-Homework.docx
@@ -1501,7 +1501,7 @@
   <w:docDefaults>
     <w:rPrDefault>
       <w:rPr>
-        <w:rFonts w:asciiTheme="minorHAnsi" w:cstheme="minorBidi" w:eastAsiaTheme="minorEastAsia" w:hAnsiTheme="minorHAnsi"/>
+        <w:rFonts w:ascii="Arial" w:cs="Arial" w:eastAsia="Arial" w:hAnsi="Arial"/>
         <w:sz w:val="24"/>
         <w:szCs w:val="24"/>
         <w:lang w:bidi="ar-SA" w:eastAsia="zh-CN" w:val="en-US"/>
@@ -1509,7 +1509,8 @@
     </w:rPrDefault>
     <w:pPrDefault>
       <w:pPr>
-        <w:spacing w:after="200"/>
+        <w:spacing w:after="200" w:line="360" w:lineRule="auto"/>
+        <w:jc w:val="both"/>
       </w:pPr>
     </w:pPrDefault>
   </w:docDefaults>
@@ -1517,6 +1518,15 @@
   <w:style w:default="1" w:styleId="Normal" w:type="paragraph">
     <w:name w:val="Normal"/>
     <w:qFormat/>
+    <w:pPr>
+      <w:spacing w:line="360" w:lineRule="auto"/>
+      <w:jc w:val="both"/>
+    </w:pPr>
+    <w:rPr>
+      <w:rFonts w:ascii="Arial" w:cs="Arial" w:eastAsia="Arial" w:hAnsi="Arial"/>
+      <w:sz w:val="24"/>
+      <w:szCs w:val="24"/>
+    </w:rPr>
   </w:style>
   <w:style w:styleId="BodyText" w:type="paragraph">
     <w:name w:val="Body Text"/>
@@ -1581,6 +1591,7 @@
     <w:qFormat/>
     <w:rsid w:val="00A10FD9"/>
     <w:pPr>
+      <w:jc w:val="left"/>
       <w:numPr>
         <w:ilvl w:val="1"/>
       </w:numPr>
@@ -1683,6 +1694,7 @@
     <w:qFormat/>
     <w:rsid w:val="00A10FD9"/>
     <w:pPr>
+      <w:jc w:val="left"/>
       <w:keepNext/>
       <w:keepLines/>
       <w:spacing w:after="80" w:before="360"/>
@@ -1706,6 +1718,7 @@
     <w:qFormat/>
     <w:rsid w:val="00A10FD9"/>
     <w:pPr>
+      <w:jc w:val="left"/>
       <w:keepNext/>
       <w:keepLines/>
       <w:spacing w:after="80" w:before="160"/>
@@ -1729,6 +1742,7 @@
     <w:qFormat/>
     <w:rsid w:val="00A10FD9"/>
     <w:pPr>
+      <w:jc w:val="left"/>
       <w:keepNext/>
       <w:keepLines/>
       <w:spacing w:after="80" w:before="160"/>
@@ -1752,6 +1766,7 @@
     <w:qFormat/>
     <w:rsid w:val="00A10FD9"/>
     <w:pPr>
+      <w:jc w:val="left"/>
       <w:keepNext/>
       <w:keepLines/>
       <w:spacing w:after="40" w:before="80"/>
@@ -1775,6 +1790,7 @@
     <w:qFormat/>
     <w:rsid w:val="00A10FD9"/>
     <w:pPr>
+      <w:jc w:val="left"/>
       <w:keepNext/>
       <w:keepLines/>
       <w:spacing w:after="40" w:before="80"/>
@@ -1796,6 +1812,7 @@
     <w:qFormat/>
     <w:rsid w:val="00A10FD9"/>
     <w:pPr>
+      <w:jc w:val="left"/>
       <w:keepNext/>
       <w:keepLines/>
       <w:spacing w:after="0" w:before="40"/>
@@ -2142,6 +2159,7 @@
     <w:unhideWhenUsed/>
     <w:qFormat/>
     <w:pPr>
+      <w:jc w:val="left"/>
       <w:spacing w:before="240" w:line="259" w:lineRule="auto"/>
       <w:outlineLvl w:val="9"/>
     </w:pPr>
@@ -2432,7 +2450,7 @@
     </a:clrScheme>
     <a:fontScheme name="Office">
       <a:majorFont>
-        <a:latin typeface="Aptos Display" panose="02110004020202020204"/>
+        <a:latin typeface="Arial" panose="02110004020202020204"/>
         <a:ea typeface=""/>
         <a:cs typeface=""/>
         <a:font script="Jpan" typeface="游ゴシック Light"/>
@@ -2484,7 +2502,7 @@
         <a:font script="Tfng" typeface="Ebrima"/>
       </a:majorFont>
       <a:minorFont>
-        <a:latin typeface="Aptos" panose="02110004020202020204"/>
+        <a:latin typeface="Arial" panose="02110004020202020204"/>
         <a:ea typeface=""/>
         <a:cs typeface=""/>
         <a:font script="Jpan" typeface="游明朝"/>

</xml_diff>